<commit_message>
Fix TU input closing for v5.8.1
</commit_message>
<xml_diff>
--- a/doc/ITS_VVC_技术报告.docx
+++ b/doc/ITS_VVC_技术报告.docx
@@ -2525,10 +2525,7 @@
         <pStyle val="ListParagraph"/>
       </pPr>
       <r>
-        <rPr>
-          <b/>
-        </rPr>
-        <t xml:space="preserve">• 验证报告：三套回归 (1444+1537+94) 共 3075 个测试用例，0 失败</t>
+        <t>• 验证报告：最终提交顶层 its_top_500_singleclk 1539/1539 PASS，core_500 94/94 PASS；历史 its_top 1444/1444 回归保留</t>
       </r>
     </p>
     <p>
@@ -13636,11 +13633,7 @@
         <ind firstLineChars="200" firstLine="460"/>
       </pPr>
       <r>
-        <rPr>
-          <rFonts ascii="Times New Roman" eastAsia="宋体" hAnsi="Times New Roman"/>
-          <color val="1F2937"/>
-        </rPr>
-        <t xml:space="preserve">所有 1537 个用例均 PASS，无 MISMATCH 或 PROTOCOL VIOLATION。</t>
+        <t>所有 1539 个提交顶层用例均 PASS，无 MISMATCH 或 PROTOCOL VIOLATION。</t>
       </r>
     </p>
     <p>
@@ -16903,11 +16896,7 @@
         <ind firstLineChars="200" firstLine="460"/>
       </pPr>
       <r>
-        <rPr>
-          <rFonts ascii="Times New Roman" eastAsia="宋体" hAnsi="Times New Roman"/>
-          <color val="1F2937"/>
-        </rPr>
-        <t xml:space="preserve">历史问题：its_core_500 与 its_top 曾存在计算结果差异，原因包括 BRAM 同步读延迟差异、LFNST overlay 地址映射边界条件、输出流水线级数差异。修复方案：独立维护 core_500 回归测试集 (94 个用例)，并通过 wrapper 1537/1537 全量回归验证端到端正确性。当前状态：所有差异已修复，三套回归全部通过。</t>
+        <t>历史问题：its_core_500 与 its_top 曾存在计算结果差异，原因包括 BRAM 同步读延迟差异、LFNST overlay 地址映射边界条件、输出流水线级数差异。修复方案：独立维护 core_500 回归测试集 (94 个用例)，并通过 its_top_500_singleclk 1539/1539 全量回归验证端到端正确性。当前状态：最终提交顶层与 core_500 回归全部通过。</t>
       </r>
     </p>
     <p>
@@ -17172,11 +17161,7 @@
         <ind firstLineChars="200" firstLine="460"/>
       </pPr>
       <r>
-        <rPr>
-          <rFonts ascii="Times New Roman" eastAsia="宋体" hAnsi="Times New Roman"/>
-          <color val="1F2937"/>
-        </rPr>
-        <t xml:space="preserve">本项目完成了 VVC (H.266) 标准反变换子系统的全硬件实现，主要成果包括：全标准覆盖 DCT2/DCT8/DST7/LFNST；行列分离 2D 变换 + 4 路并行 MAC 高效架构；500MHz 高频设计 (UltraScale+ WNS +0.058ns, WHS +0.038ns)；Gray-code 异步 FIFO + toggle CDC 双时钟架构；三套回归全部通过 (its_top 1444/1444 + wrapper 1537/1537 + core_500 94/94) (its_top 1444 + wrapper 1537 + core_500 94)；10 个 RTL 源文件 + 完整工具链和文档。</t>
+        <t>本项目完成了 VVC (H.266) 标准反变换子系统的全硬件实现，主要成果包括：全标准覆盖 DCT2/DCT8/DST7/LFNST；行列分离 2D 变换 + 4 路并行 MAC 高效架构；500MHz 高频设计 (UltraScale+ v5.8 WNS +0.053ns, WHS +0.035ns，v5.8.1 功能小修待复刷)；Gray-code 异步 FIFO + toggle CDC 架构；最终提交顶层 1539/1539 与 core_500 94/94 回归通过；覆盖官方 Q&amp;A 中垂直优先、稀疏输入、10bit 补码和连续 TU 协议要求。</t>
       </r>
     </p>
     <p>
@@ -18876,11 +18861,7 @@
         <ind firstLineChars="200" firstLine="460"/>
       </pPr>
       <r>
-        <rPr>
-          <rFonts ascii="Times New Roman" eastAsia="宋体" hAnsi="Times New Roman"/>
-          <color val="1F2937"/>
-        </rPr>
-        <t xml:space="preserve">gen_test_vectors.py：生成 1537 个测试用例的输入和黄金参考。</t>
+        <t>gen_test_vectors.py：生成穷举回归测试用例的输入和黄金参考；its_tb_500.v 在此基础上扩展至 1539 个提交顶层协议/回归测试。</t>
       </r>
     </p>
     <p>

</xml_diff>